<commit_message>
Record the Phase 3 reviews and close the spent-room hole in S04.
A named room that was already used no longer counts as a new opening, and the card packet matches that rule.

Co-authored-by: Cursor <cursoragent@cursor.com>
</commit_message>
<xml_diff>
--- a/release/Printable_Cards_and_Worksheets_v1_draft.docx
+++ b/release/Printable_Cards_and_Worksheets_v1_draft.docx
@@ -1768,7 +1768,7 @@
         <w:t xml:space="preserve"> — </w:t>
       </w:r>
       <w:r>
-        <w:t>When the 10-minute timer ends, or if you left early, say one sentence, then pass through the hall. "Dark walk." At the mark, choose block or hallway, then dark walk step 1. "Quiet chair." Quiet chair step 1. "Hall." Say the count and read the Hall card. "Hall instead," said before the next threshold, replaces a named room. If the version lock has been reached, only "Hall" is open.</w:t>
+        <w:t>When the 10-minute timer ends, or if you left early, say one sentence, then pass through the hall. "Dark walk." At the mark, choose block or hallway, then dark walk step 1. "Quiet chair." Quiet chair step 1. "Hall." Say the count and read the Hall card. A room you have already entered is closed. Name one you have not entered, or say "Hall." "Hall instead," said before the next threshold, replaces the named room. If the version lock has been reached, only "Hall" is open.</w:t>
       </w:r>
     </w:p>
     <w:p>
@@ -1783,7 +1783,7 @@
         <w:t xml:space="preserve"> — </w:t>
       </w:r>
       <w:r>
-        <w:t>Read this stopped at your door or at the end of the indoor route. Block and hallway are one room. Either spends it. "Kitchen." Return to the mark, then kitchen step 1. "Quiet chair." Return to the mark, then quiet chair step 1. "Hall." Say the count and read the Hall card. If the version lock has been reached, only "Hall" is open.</w:t>
+        <w:t>Read this stopped at your door or at the end of the indoor route. Block and hallway are one room. Either spends it. "Kitchen." Return to the mark, then kitchen step 1. "Quiet chair." Return to the mark, then quiet chair step 1. "Hall." Say the count and read the Hall card. A room you have already entered is closed. Name one you have not entered, or say "Hall." If the version lock has been reached, only "Hall" is open.</w:t>
       </w:r>
     </w:p>
     <w:p>
@@ -1798,7 +1798,7 @@
         <w:t xml:space="preserve"> — </w:t>
       </w:r>
       <w:r>
-        <w:t>Read this after the question and after the hand or the decline. A declined hand does not change the sentences. "Kitchen." Stand, return to the mark, kitchen step 1. "Dark walk." Stand, return, choose block or hallway, dark walk step 1. "Hall." Stand, return, say the count, read the Hall card. If the version lock has been reached, only "Hall" is open.</w:t>
+        <w:t>Read this after the question and after the hand or the decline. A declined hand does not change the sentences. "Kitchen." Stand, return to the mark, kitchen step 1. "Dark walk." Stand, return, choose block or hallway, dark walk step 1. "Hall." Stand, return, say the count, read the Hall card. A room you have already entered is closed. Name one you have not entered, or say "Hall." If the version lock has been reached, only "Hall" is open.</w:t>
       </w:r>
     </w:p>
     <w:p>

</xml_diff>